<commit_message>
Sync how_search_works.docx with production v1 algorithm
Doc was describing the pre-deployment v0.1 weights (γ=0.4, RETRIEVAL_K=30,
4-dimension scoring formula, "logs everything"). Production v1 ships
γ=0 (round-robin replaces MMR), RETRIEVAL_K=max(K×6,60), 3-dimension
scoring, no audit log. Now matches the live code:

- Pipeline now 8 stages (round-robin gets its own step).
- Worked example recomputed with v1 formula (Aya 0.95, Noah 0.57, 0.41).
- Diversity (γ) moved into Section 6 deferred list with promotion criteria.
- Audit logging moved into Section 6; Step 8 reframed as
  "surface the score breakdown" — what the code actually does.
- Section 4 strategic decisions table gains a γ row explaining the choice.
- Section 5 marks the eval numbers as pre-γ=0; need re-measurement.

Generator: notebooks/build_how_search_works.py — re-run whenever
web/lib/search.ts changes. Living-doc rule per memory.

Co-Authored-By: Claude Opus 4.7 (1M context) <noreply@anthropic.com>
</commit_message>
<xml_diff>
--- a/notebooks/how_search_works.docx
+++ b/notebooks/how_search_works.docx
@@ -5,64 +5,22 @@
     <w:p>
       <w:pPr>
         <w:pStyle w:val="Title"/>
-        <w:jc w:val="center"/>
       </w:pPr>
       <w:r>
         <w:t>How the Search Algorithm Works</w:t>
       </w:r>
     </w:p>
     <w:p>
-      <w:pPr>
-        <w:jc w:val="center"/>
-      </w:pPr>
-      <w:r>
-        <w:rPr>
-          <w:i/>
-          <w:sz w:val="26"/>
-        </w:rPr>
-        <w:t>A plain-English guide for the team</w:t>
-      </w:r>
-    </w:p>
-    <w:p/>
-    <w:p>
-      <w:pPr>
-        <w:jc w:val="center"/>
-      </w:pPr>
       <w:r>
         <w:rPr>
           <w:i/>
         </w:rPr>
-        <w:t xml:space="preserve">Companion to </w:t>
-      </w:r>
-      <w:r>
-        <w:rPr>
-          <w:rFonts w:ascii="Consolas" w:hAnsi="Consolas"/>
-          <w:i/>
-        </w:rPr>
-        <w:t>algorithm_design.ipynb</w:t>
-      </w:r>
-      <w:r>
-        <w:rPr>
-          <w:i/>
-        </w:rPr>
-        <w:t xml:space="preserve"> · Living document — last updated 2026-04-25 · OIT 277 Artist Marketplace project</w:t>
-      </w:r>
-    </w:p>
-    <w:p/>
-    <w:p>
-      <w:pPr>
-        <w:jc w:val="center"/>
-      </w:pPr>
-      <w:r>
-        <w:rPr>
-          <w:i/>
-        </w:rPr>
-        <w:t>Read top to bottom. No technical background needed. Tables and analogies do most of the work.</w:t>
+        <w:t>Companion to algorithm_design.ipynb · Living document — last updated 2026-04-25 · OIT 277 Artist Marketplace project</w:t>
       </w:r>
     </w:p>
     <w:p>
       <w:r>
-        <w:br w:type="page"/>
+        <w:t>Read top to bottom. No technical background needed. Tables and analogies do most of the work.</w:t>
       </w:r>
     </w:p>
     <w:p>
@@ -75,36 +33,44 @@
     </w:p>
     <w:p>
       <w:r>
-        <w:t>When a buyer types something like "moody lo-fi music for a quiet vlog under $80," our algorithm does seven things in order:</w:t>
+        <w:t>When a buyer types something like “moody lo-fi music for a quiet vlog under $80,” our algorithm does eight things in order:</w:t>
       </w:r>
     </w:p>
     <w:p>
       <w:pPr>
-        <w:pStyle w:val="ListBullet"/>
+        <w:pStyle w:val="ListNumber"/>
       </w:pPr>
       <w:r>
-        <w:t>Removes anything that does not match the buyer's must-haves (wrong medium, way over budget, not verified when they asked for verified).</w:t>
+        <w:t>Removes anything that does not match the buyer’s must-haves (wrong medium, way over budget, not verified when they asked for verified).</w:t>
       </w:r>
     </w:p>
     <w:p>
       <w:pPr>
-        <w:pStyle w:val="ListBullet"/>
+        <w:pStyle w:val="ListNumber"/>
       </w:pPr>
       <w:r>
-        <w:t>Picks the 30 closest matches by meaning — not by keyword. The system understands that "lo-fi" and "chill" are related even though they are different words.</w:t>
+        <w:t>Picks the 60 closest matches by meaning — not by keyword. The system understands that “lo-fi” and “chill” are related even though they are different words.</w:t>
       </w:r>
     </w:p>
     <w:p>
       <w:pPr>
-        <w:pStyle w:val="ListBullet"/>
+        <w:pStyle w:val="ListNumber"/>
       </w:pPr>
       <w:r>
-        <w:t>Scores each of the 30 on four dimensions: relevance, diversity, emerging-artist boost, and price penalty.</w:t>
+        <w:t>Scores each of the 60 on three dimensions: relevance, emerging-artist boost, and price penalty. (Diversity is handled mechanically in the next step — it is not a score weight in v1.)</w:t>
       </w:r>
     </w:p>
     <w:p>
       <w:pPr>
-        <w:pStyle w:val="ListBullet"/>
+        <w:pStyle w:val="ListNumber"/>
+      </w:pPr>
+      <w:r>
+        <w:t>Spreads results across artists by round-robin, so one creator cannot dominate the top spots.</w:t>
+      </w:r>
+    </w:p>
+    <w:p>
+      <w:pPr>
+        <w:pStyle w:val="ListNumber"/>
       </w:pPr>
       <w:r>
         <w:t>Returns the top 8 by combined score.</w:t>
@@ -112,7 +78,7 @@
     </w:p>
     <w:p>
       <w:pPr>
-        <w:pStyle w:val="ListBullet"/>
+        <w:pStyle w:val="ListNumber"/>
       </w:pPr>
       <w:r>
         <w:t>Double-checks that at least 1–2 emerging artists are in the top 8. If not, swaps in the best emerging artist who passed a relevance bar.</w:t>
@@ -120,7 +86,7 @@
     </w:p>
     <w:p>
       <w:pPr>
-        <w:pStyle w:val="ListBullet"/>
+        <w:pStyle w:val="ListNumber"/>
       </w:pPr>
       <w:r>
         <w:t>Labels each result with a confidence tag: HIGH, MEDIUM, LOW, or NO_MATCH.</w:t>
@@ -128,13 +94,12 @@
     </w:p>
     <w:p>
       <w:pPr>
-        <w:pStyle w:val="ListBullet"/>
+        <w:pStyle w:val="ListNumber"/>
       </w:pPr>
       <w:r>
-        <w:t>Logs everything — query, filters, score breakdown, swaps — so we can always explain why a result ranked the way it did.</w:t>
+        <w:t>Surfaces the per-component score breakdown to callers (so the UI can explain why each result ranked where it did).</w:t>
       </w:r>
     </w:p>
-    <w:p/>
     <w:p>
       <w:r>
         <w:rPr>
@@ -155,9 +120,6 @@
       </w:r>
     </w:p>
     <w:p>
-      <w:pPr>
-        <w:ind w:left="576" w:right="576"/>
-      </w:pPr>
       <w:r>
         <w:rPr>
           <w:i/>
@@ -167,12 +129,12 @@
     </w:p>
     <w:p>
       <w:r>
-        <w:t>This is a stronger stance than most marketplaces take. Etsy, for example, optimizes for "what is most likely to be clicked," which over time means drop-shippers winning over handmade sellers. We are deliberately resisting that pattern.</w:t>
+        <w:t>This is a stronger stance than most marketplaces take. Etsy, for example, optimizes for “what is most likely to be clicked,” which over time means drop-shippers winning over handmade sellers. We are deliberately resisting that pattern.</w:t>
       </w:r>
     </w:p>
     <w:p>
       <w:r>
-        <w:t>The technical name for our objective is "emerging-artist exposure." That is what the entire algorithm is engineered around.</w:t>
+        <w:t>The technical name for our objective is “emerging-artist exposure.” That is what the entire algorithm is engineered around.</w:t>
       </w:r>
     </w:p>
     <w:p>
@@ -180,23 +142,23 @@
         <w:pStyle w:val="Heading1"/>
       </w:pPr>
       <w:r>
-        <w:t>3. The Pipeline — What Happens When You Click "Search"</w:t>
+        <w:t>3. The Pipeline — What Happens When You Click “Search”</w:t>
       </w:r>
     </w:p>
     <w:p>
       <w:r>
-        <w:t xml:space="preserve">Imagine the algorithm as a librarian helping you find a book. Here is what they do, step by step, using the running example: </w:t>
+        <w:t>Imagine the algorithm as a librarian helping you find a book. Here is what they do, step by step, using the running example:</w:t>
       </w:r>
     </w:p>
     <w:p>
-      <w:pPr>
-        <w:ind w:left="576"/>
-      </w:pPr>
+      <w:r>
+        <w:t xml:space="preserve">Buyer types: </w:t>
+      </w:r>
       <w:r>
         <w:rPr>
           <w:i/>
         </w:rPr>
-        <w:t>Buyer types: "moody lo-fi music for a quiet vlog, budget $65, only verified artists."</w:t>
+        <w:t>“moody lo-fi music for a quiet vlog, budget $65, only verified artists.”</w:t>
       </w:r>
     </w:p>
     <w:p>
@@ -217,7 +179,7 @@
         <w:pStyle w:val="ListBullet"/>
       </w:pPr>
       <w:r>
-        <w:t>The vibe of what they want: "moody lo-fi music for a quiet vlog"</w:t>
+        <w:t>The vibe of what they want: “moody lo-fi music for a quiet vlog”</w:t>
       </w:r>
     </w:p>
     <w:p>
@@ -236,7 +198,7 @@
         <w:t xml:space="preserve">Why separate? </w:t>
       </w:r>
       <w:r>
-        <w:t>Because the librarian treats these differently. The vibe is fuzzy — "lo-fi" could match many things. The hard rules are non-negotiable — a buyer who said "music" does not want a video.</w:t>
+        <w:t>Because the librarian treats these differently. The vibe is fuzzy — “lo-fi” could match many things. The hard rules are non-negotiable — a buyer who said “music” does not want a video.</w:t>
       </w:r>
     </w:p>
     <w:p>
@@ -284,7 +246,7 @@
         <w:t xml:space="preserve">Why $97.50, not $65? </w:t>
       </w:r>
       <w:r>
-        <w:t>Because the buyer's "$65 budget" is a preference, not a hard wall. A truly outstanding $80 work might still be worth showing. But $200 is too far over. So we draw the line at 1.5× the budget — far enough to give wiggle room, close enough that we are still respecting the buyer.</w:t>
+        <w:t>Because the buyer’s “$65 budget” is a preference, not a hard wall. A truly outstanding $80 work might still be worth showing. But $200 is too far over. So we draw the line at 1.5× the budget — far enough to give wiggle room, close enough that we are still respecting the buyer.</w:t>
       </w:r>
     </w:p>
     <w:p>
@@ -292,17 +254,12 @@
         <w:pStyle w:val="Heading2"/>
       </w:pPr>
       <w:r>
-        <w:t>Step 3 — Find the 30 closest matches</w:t>
+        <w:t>Step 3 — Find the 60 closest matches</w:t>
       </w:r>
     </w:p>
     <w:p>
       <w:r>
-        <w:t>From what is left, the librarian picks the 30 books whose meaning is closest to "moody lo-fi music for a quiet vlog."</w:t>
-      </w:r>
-    </w:p>
-    <w:p>
-      <w:r>
-        <w:t>How? Each book has a meaning fingerprint — a numerical summary of its mood, style, and topic. The buyer's query also gets a fingerprint. The librarian compares fingerprints and picks the 30 closest.</w:t>
+        <w:t>From what is left, the librarian picks the 60 books whose meaning is closest to “moody lo-fi music for a quiet vlog.”</w:t>
       </w:r>
     </w:p>
     <w:p>
@@ -310,10 +267,21 @@
         <w:rPr>
           <w:b/>
         </w:rPr>
-        <w:t xml:space="preserve">Why 30, not 8? </w:t>
+        <w:t xml:space="preserve">How? </w:t>
       </w:r>
       <w:r>
-        <w:t>Because the next step does more careful work, and we want a high-quality candidate pool. Like screening 1,000 résumés down to 30 before doing in-depth interviews on each.</w:t>
+        <w:t>Each book has a meaning fingerprint — a numerical summary of its mood, style, and topic. The buyer’s query also gets a fingerprint. The librarian compares fingerprints and picks the 60 closest.</w:t>
+      </w:r>
+    </w:p>
+    <w:p>
+      <w:r>
+        <w:rPr>
+          <w:b/>
+        </w:rPr>
+        <w:t xml:space="preserve">Why 60, not 8? </w:t>
+      </w:r>
+      <w:r>
+        <w:t>Because the next steps do more careful work, and we want a high-quality candidate pool with room for the diversity rerank and quota repair to do their jobs. Like screening 1,000 résumés down to 60 before doing in-depth interviews on each. (The exact rule in code: max(K × 6, 60), so for K = 8 we fetch 60.)</w:t>
       </w:r>
     </w:p>
     <w:p>
@@ -321,12 +289,12 @@
         <w:pStyle w:val="Heading2"/>
       </w:pPr>
       <w:r>
-        <w:t>Step 4 — Score each candidate on multiple dimensions</w:t>
+        <w:t>Step 4 — Score each candidate</w:t>
       </w:r>
     </w:p>
     <w:p>
       <w:r>
-        <w:t>This is where the strategy lives. For each of the 30 candidates, the librarian computes a final score by combining four things:</w:t>
+        <w:t>This is where the strategy lives. For each of the 60 candidates, the librarian computes a score by combining three things:</w:t>
       </w:r>
     </w:p>
     <w:tbl>
@@ -343,39 +311,30 @@
       <w:tr>
         <w:tc>
           <w:tcPr>
-            <w:tcW w:type="dxa" w:w="2160"/>
+            <w:tcW w:type="dxa" w:w="2880"/>
           </w:tcPr>
           <w:p>
             <w:r>
-              <w:rPr>
-                <w:b/>
-              </w:rPr>
               <w:t>Dimension</w:t>
             </w:r>
           </w:p>
         </w:tc>
         <w:tc>
           <w:tcPr>
-            <w:tcW w:type="dxa" w:w="5040"/>
+            <w:tcW w:type="dxa" w:w="2880"/>
           </w:tcPr>
           <w:p>
             <w:r>
-              <w:rPr>
-                <w:b/>
-              </w:rPr>
               <w:t>What it asks</w:t>
             </w:r>
           </w:p>
         </w:tc>
         <w:tc>
           <w:tcPr>
-            <w:tcW w:type="dxa" w:w="1440"/>
+            <w:tcW w:type="dxa" w:w="2880"/>
           </w:tcPr>
           <w:p>
             <w:r>
-              <w:rPr>
-                <w:b/>
-              </w:rPr>
               <w:t>Weight (v1)</w:t>
             </w:r>
           </w:p>
@@ -384,7 +343,7 @@
       <w:tr>
         <w:tc>
           <w:tcPr>
-            <w:tcW w:type="dxa" w:w="2160"/>
+            <w:tcW w:type="dxa" w:w="2880"/>
           </w:tcPr>
           <w:p>
             <w:r>
@@ -394,7 +353,7 @@
         </w:tc>
         <w:tc>
           <w:tcPr>
-            <w:tcW w:type="dxa" w:w="5040"/>
+            <w:tcW w:type="dxa" w:w="2880"/>
           </w:tcPr>
           <w:p>
             <w:r>
@@ -404,7 +363,7 @@
         </w:tc>
         <w:tc>
           <w:tcPr>
-            <w:tcW w:type="dxa" w:w="1440"/>
+            <w:tcW w:type="dxa" w:w="2880"/>
           </w:tcPr>
           <w:p>
             <w:r>
@@ -416,39 +375,7 @@
       <w:tr>
         <w:tc>
           <w:tcPr>
-            <w:tcW w:type="dxa" w:w="2160"/>
-          </w:tcPr>
-          <w:p>
-            <w:r>
-              <w:t>Diversity (γ)</w:t>
-            </w:r>
-          </w:p>
-        </w:tc>
-        <w:tc>
-          <w:tcPr>
-            <w:tcW w:type="dxa" w:w="5040"/>
-          </w:tcPr>
-          <w:p>
-            <w:r>
-              <w:t>How different is this from items already shown?</w:t>
-            </w:r>
-          </w:p>
-        </w:tc>
-        <w:tc>
-          <w:tcPr>
-            <w:tcW w:type="dxa" w:w="1440"/>
-          </w:tcPr>
-          <w:p>
-            <w:r>
-              <w:t>0.4</w:t>
-            </w:r>
-          </w:p>
-        </w:tc>
-      </w:tr>
-      <w:tr>
-        <w:tc>
-          <w:tcPr>
-            <w:tcW w:type="dxa" w:w="2160"/>
+            <w:tcW w:type="dxa" w:w="2880"/>
           </w:tcPr>
           <w:p>
             <w:r>
@@ -458,17 +385,17 @@
         </w:tc>
         <w:tc>
           <w:tcPr>
-            <w:tcW w:type="dxa" w:w="5040"/>
+            <w:tcW w:type="dxa" w:w="2880"/>
           </w:tcPr>
           <w:p>
             <w:r>
-              <w:t>Does this give exposure to a new/emerging artist?</w:t>
+              <w:t>Does this give exposure to a new/emerging artist? (Only counted when relevance ≥ 0.20, so we never boost low-relevance results just for being emerging.)</w:t>
             </w:r>
           </w:p>
         </w:tc>
         <w:tc>
           <w:tcPr>
-            <w:tcW w:type="dxa" w:w="1440"/>
+            <w:tcW w:type="dxa" w:w="2880"/>
           </w:tcPr>
           <w:p>
             <w:r>
@@ -480,7 +407,7 @@
       <w:tr>
         <w:tc>
           <w:tcPr>
-            <w:tcW w:type="dxa" w:w="2160"/>
+            <w:tcW w:type="dxa" w:w="2880"/>
           </w:tcPr>
           <w:p>
             <w:r>
@@ -490,17 +417,17 @@
         </w:tc>
         <w:tc>
           <w:tcPr>
-            <w:tcW w:type="dxa" w:w="5040"/>
+            <w:tcW w:type="dxa" w:w="2880"/>
           </w:tcPr>
           <w:p>
             <w:r>
-              <w:t>How far is this over the buyer's budget? (subtracted)</w:t>
+              <w:t>How far is this over the buyer’s budget? (subtracted)</w:t>
             </w:r>
           </w:p>
         </w:tc>
         <w:tc>
           <w:tcPr>
-            <w:tcW w:type="dxa" w:w="1440"/>
+            <w:tcW w:type="dxa" w:w="2880"/>
           </w:tcPr>
           <w:p>
             <w:r>
@@ -510,26 +437,33 @@
         </w:tc>
       </w:tr>
     </w:tbl>
-    <w:p/>
     <w:p>
       <w:r>
         <w:t>The final score is:</w:t>
       </w:r>
     </w:p>
     <w:p>
-      <w:pPr>
-        <w:jc w:val="center"/>
-      </w:pPr>
       <w:r>
         <w:rPr>
           <w:b/>
         </w:rPr>
-        <w:t>Score = 1.0 × Relevance + 0.4 × Diversity + 0.5 × Health − 0.6 × Price Penalty</w:t>
+        <w:t>Score = 1.0 × Relevance + 0.5 × Health − 0.6 × Price Penalty</w:t>
       </w:r>
     </w:p>
     <w:p>
       <w:r>
         <w:t>Each dimension is a number between 0 and 1.</w:t>
+      </w:r>
+    </w:p>
+    <w:p>
+      <w:r>
+        <w:rPr>
+          <w:b/>
+        </w:rPr>
+        <w:t xml:space="preserve">A note on diversity. </w:t>
+      </w:r>
+      <w:r>
+        <w:t>An earlier draft of this document included a fourth dimension — Diversity (γ) — that lowered a result’s score if it was too similar to items already shown. In v1 we replaced that with a simpler mechanical step: round-robin by artist (Step 5). Cheaper, more predictable, and γ in the live code is set to 0. The MMR-style diversity weight is reserved for v2.</w:t>
       </w:r>
     </w:p>
     <w:p>
@@ -542,7 +476,7 @@
     </w:p>
     <w:p>
       <w:r>
-        <w:t>Below: three actual candidates the system considered for the running query, with their breakdown.</w:t>
+        <w:t>Three candidates the system considered for the running query, scored with the v1 formula:</w:t>
       </w:r>
     </w:p>
     <w:tbl>
@@ -552,88 +486,59 @@
         <w:tblLook w:firstColumn="1" w:firstRow="1" w:lastColumn="0" w:lastRow="0" w:noHBand="0" w:noVBand="1" w:val="04A0"/>
       </w:tblPr>
       <w:tblGrid>
-        <w:gridCol w:w="1440"/>
-        <w:gridCol w:w="1440"/>
-        <w:gridCol w:w="1440"/>
-        <w:gridCol w:w="1440"/>
-        <w:gridCol w:w="1440"/>
-        <w:gridCol w:w="1440"/>
+        <w:gridCol w:w="1728"/>
+        <w:gridCol w:w="1728"/>
+        <w:gridCol w:w="1728"/>
+        <w:gridCol w:w="1728"/>
+        <w:gridCol w:w="1728"/>
       </w:tblGrid>
       <w:tr>
         <w:tc>
           <w:tcPr>
-            <w:tcW w:type="dxa" w:w="3168"/>
+            <w:tcW w:type="dxa" w:w="1728"/>
           </w:tcPr>
           <w:p>
             <w:r>
-              <w:rPr>
-                <w:b/>
-              </w:rPr>
               <w:t>Candidate</w:t>
             </w:r>
           </w:p>
         </w:tc>
         <w:tc>
           <w:tcPr>
-            <w:tcW w:type="dxa" w:w="1152"/>
+            <w:tcW w:type="dxa" w:w="1728"/>
           </w:tcPr>
           <w:p>
             <w:r>
-              <w:rPr>
-                <w:b/>
-              </w:rPr>
               <w:t>Relevance</w:t>
             </w:r>
           </w:p>
         </w:tc>
         <w:tc>
           <w:tcPr>
-            <w:tcW w:type="dxa" w:w="2016"/>
+            <w:tcW w:type="dxa" w:w="1728"/>
           </w:tcPr>
           <w:p>
             <w:r>
-              <w:rPr>
-                <w:b/>
-              </w:rPr>
-              <w:t>Diversity</w:t>
-            </w:r>
-          </w:p>
-        </w:tc>
-        <w:tc>
-          <w:tcPr>
-            <w:tcW w:type="dxa" w:w="2016"/>
-          </w:tcPr>
-          <w:p>
-            <w:r>
-              <w:rPr>
-                <w:b/>
-              </w:rPr>
               <w:t>Health (emerging?)</w:t>
             </w:r>
           </w:p>
         </w:tc>
         <w:tc>
           <w:tcPr>
-            <w:tcW w:type="dxa" w:w="1440"/>
+            <w:tcW w:type="dxa" w:w="1728"/>
           </w:tcPr>
           <w:p>
             <w:r>
-              <w:rPr>
-                <w:b/>
-              </w:rPr>
               <w:t>Price</w:t>
             </w:r>
           </w:p>
         </w:tc>
         <w:tc>
           <w:tcPr>
-            <w:tcW w:type="dxa" w:w="1152"/>
+            <w:tcW w:type="dxa" w:w="1728"/>
           </w:tcPr>
           <w:p>
             <w:r>
-              <w:rPr>
-                <w:b/>
-              </w:rPr>
               <w:t>Final score</w:t>
             </w:r>
           </w:p>
@@ -642,17 +547,17 @@
       <w:tr>
         <w:tc>
           <w:tcPr>
-            <w:tcW w:type="dxa" w:w="3168"/>
+            <w:tcW w:type="dxa" w:w="1728"/>
           </w:tcPr>
           <w:p>
             <w:r>
-              <w:t>Aya Tolentino — "Rainy Day Reverie"</w:t>
+              <w:t>Aya Tolentino — “Rainy Day Reverie”</w:t>
             </w:r>
           </w:p>
         </w:tc>
         <w:tc>
           <w:tcPr>
-            <w:tcW w:type="dxa" w:w="1152"/>
+            <w:tcW w:type="dxa" w:w="1728"/>
           </w:tcPr>
           <w:p>
             <w:r>
@@ -662,17 +567,7 @@
         </w:tc>
         <w:tc>
           <w:tcPr>
-            <w:tcW w:type="dxa" w:w="2016"/>
-          </w:tcPr>
-          <w:p>
-            <w:r>
-              <w:t>1.00 (1st item, full credit)</w:t>
-            </w:r>
-          </w:p>
-        </w:tc>
-        <w:tc>
-          <w:tcPr>
-            <w:tcW w:type="dxa" w:w="2016"/>
+            <w:tcW w:type="dxa" w:w="1728"/>
           </w:tcPr>
           <w:p>
             <w:r>
@@ -682,7 +577,7 @@
         </w:tc>
         <w:tc>
           <w:tcPr>
-            <w:tcW w:type="dxa" w:w="1440"/>
+            <w:tcW w:type="dxa" w:w="1728"/>
           </w:tcPr>
           <w:p>
             <w:r>
@@ -692,11 +587,11 @@
         </w:tc>
         <w:tc>
           <w:tcPr>
-            <w:tcW w:type="dxa" w:w="1152"/>
+            <w:tcW w:type="dxa" w:w="1728"/>
           </w:tcPr>
           <w:p>
             <w:r>
-              <w:t>1.35</w:t>
+              <w:t>0.95</w:t>
             </w:r>
           </w:p>
         </w:tc>
@@ -704,17 +599,17 @@
       <w:tr>
         <w:tc>
           <w:tcPr>
-            <w:tcW w:type="dxa" w:w="3168"/>
+            <w:tcW w:type="dxa" w:w="1728"/>
           </w:tcPr>
           <w:p>
             <w:r>
-              <w:t>Noah Patel — "Midnight Loop"</w:t>
+              <w:t>Noah Patel — “Midnight Loop”</w:t>
             </w:r>
           </w:p>
         </w:tc>
         <w:tc>
           <w:tcPr>
-            <w:tcW w:type="dxa" w:w="1152"/>
+            <w:tcW w:type="dxa" w:w="1728"/>
           </w:tcPr>
           <w:p>
             <w:r>
@@ -724,17 +619,7 @@
         </w:tc>
         <w:tc>
           <w:tcPr>
-            <w:tcW w:type="dxa" w:w="2016"/>
-          </w:tcPr>
-          <w:p>
-            <w:r>
-              <w:t>0.46</w:t>
-            </w:r>
-          </w:p>
-        </w:tc>
-        <w:tc>
-          <w:tcPr>
-            <w:tcW w:type="dxa" w:w="2016"/>
+            <w:tcW w:type="dxa" w:w="1728"/>
           </w:tcPr>
           <w:p>
             <w:r>
@@ -744,7 +629,7 @@
         </w:tc>
         <w:tc>
           <w:tcPr>
-            <w:tcW w:type="dxa" w:w="1440"/>
+            <w:tcW w:type="dxa" w:w="1728"/>
           </w:tcPr>
           <w:p>
             <w:r>
@@ -754,11 +639,11 @@
         </w:tc>
         <w:tc>
           <w:tcPr>
-            <w:tcW w:type="dxa" w:w="1152"/>
+            <w:tcW w:type="dxa" w:w="1728"/>
           </w:tcPr>
           <w:p>
             <w:r>
-              <w:t>0.76</w:t>
+              <w:t>0.57</w:t>
             </w:r>
           </w:p>
         </w:tc>
@@ -766,17 +651,17 @@
       <w:tr>
         <w:tc>
           <w:tcPr>
-            <w:tcW w:type="dxa" w:w="3168"/>
+            <w:tcW w:type="dxa" w:w="1728"/>
           </w:tcPr>
           <w:p>
             <w:r>
-              <w:t>Noah Patel — "Window Light"</w:t>
+              <w:t>Noah Patel — “Window Light”</w:t>
             </w:r>
           </w:p>
         </w:tc>
         <w:tc>
           <w:tcPr>
-            <w:tcW w:type="dxa" w:w="1152"/>
+            <w:tcW w:type="dxa" w:w="1728"/>
           </w:tcPr>
           <w:p>
             <w:r>
@@ -786,17 +671,7 @@
         </w:tc>
         <w:tc>
           <w:tcPr>
-            <w:tcW w:type="dxa" w:w="2016"/>
-          </w:tcPr>
-          <w:p>
-            <w:r>
-              <w:t>0.46</w:t>
-            </w:r>
-          </w:p>
-        </w:tc>
-        <w:tc>
-          <w:tcPr>
-            <w:tcW w:type="dxa" w:w="2016"/>
+            <w:tcW w:type="dxa" w:w="1728"/>
           </w:tcPr>
           <w:p>
             <w:r>
@@ -806,27 +681,26 @@
         </w:tc>
         <w:tc>
           <w:tcPr>
-            <w:tcW w:type="dxa" w:w="1440"/>
+            <w:tcW w:type="dxa" w:w="1728"/>
           </w:tcPr>
           <w:p>
             <w:r>
-              <w:t>$72 (slightly over budget)</w:t>
+              <w:t>$72 (slightly over budget, pen ≈ 0.05)</w:t>
             </w:r>
           </w:p>
         </w:tc>
         <w:tc>
           <w:tcPr>
-            <w:tcW w:type="dxa" w:w="1152"/>
+            <w:tcW w:type="dxa" w:w="1728"/>
           </w:tcPr>
           <w:p>
             <w:r>
-              <w:t>0.60</w:t>
+              <w:t>0.41</w:t>
             </w:r>
           </w:p>
         </w:tc>
       </w:tr>
     </w:tbl>
-    <w:p/>
     <w:p>
       <w:r>
         <w:rPr>
@@ -835,7 +709,7 @@
         <w:t xml:space="preserve">Why Aya wins despite Noah having higher relevance: </w:t>
       </w:r>
       <w:r>
-        <w:t>She is emerging (900 followers vs Noah's 12,000) → +0.5 boost. She is the first item, so she gets full diversity credit → +0.4. The math: 1.0 × 0.45 + 0.4 × 1.00 + 0.5 × 1.00 = 1.35.</w:t>
+        <w:t>She is emerging (900 followers vs Noah’s 12,000) → +0.5 boost. The math: 1.0 × 0.45 + 0.5 × 1.00 = 0.95.</w:t>
       </w:r>
     </w:p>
     <w:p>
@@ -846,7 +720,7 @@
         <w:t xml:space="preserve">Why the third Noah work loses points: </w:t>
       </w:r>
       <w:r>
-        <w:t>$72 is $7 over the $65 budget. Inside the soft band ($65–$97.50), the price penalty is small but nonzero.</w:t>
+        <w:t>$72 is $7 over the $65 budget. Inside the soft band ($65–$97.50), the penalty is small (about 0.05) but nonzero. The math: 1.0 × 0.44 + 0.5 × 0 − 0.6 × 0.05 ≈ 0.41.</w:t>
       </w:r>
     </w:p>
     <w:p>
@@ -859,7 +733,7 @@
     </w:p>
     <w:p>
       <w:r>
-        <w:t>The numbers (1.0 / 0.4 / 0.5 / 0.6) are the platform's strategy in code form:</w:t>
+        <w:t>The numbers (1.0 / 0.5 / 0.6) are the platform’s strategy in code form:</w:t>
       </w:r>
     </w:p>
     <w:p>
@@ -868,14 +742,6 @@
       </w:pPr>
       <w:r>
         <w:t>Increase δ → push emerging artists harder.</w:t>
-      </w:r>
-    </w:p>
-    <w:p>
-      <w:pPr>
-        <w:pStyle w:val="ListBullet"/>
-      </w:pPr>
-      <w:r>
-        <w:t>Increase γ → punish repetitive results.</w:t>
       </w:r>
     </w:p>
     <w:p>
@@ -895,6 +761,14 @@
       </w:r>
     </w:p>
     <w:p>
+      <w:pPr>
+        <w:pStyle w:val="ListBullet"/>
+      </w:pPr>
+      <w:r>
+        <w:t>Increase γ (currently 0) → turn embedding-based diversity back on. We chose round-robin instead for v1.</w:t>
+      </w:r>
+    </w:p>
+    <w:p>
       <w:r>
         <w:t>The product team owns those numbers. Engineers do not change them; engineers change the formula structure.</w:t>
       </w:r>
@@ -904,12 +778,36 @@
         <w:pStyle w:val="Heading2"/>
       </w:pPr>
       <w:r>
-        <w:t>Step 5 — Quota repair (the safety net)</w:t>
+        <w:t>Step 5 — Spread results across artists</w:t>
       </w:r>
     </w:p>
     <w:p>
       <w:r>
-        <w:t>After scoring, the librarian looks at the top 8 and asks: "Do at least 2 emerging artists appear?" (For top-5, the threshold is 1.)</w:t>
+        <w:t>Even with strong scores, three works by the same prolific artist can easily land in the top 8 — not the experience we want. So the librarian reorders the scored list by round-robin: take the top-scoring work by Artist A, then Artist B, then Artist C… and keep cycling until each artist’s queue is empty or the slot count is hit. Within each artist’s pile the score order is preserved.</w:t>
+      </w:r>
+    </w:p>
+    <w:p>
+      <w:r>
+        <w:rPr>
+          <w:b/>
+        </w:rPr>
+        <w:t xml:space="preserve">Why mechanical and not weighted? </w:t>
+      </w:r>
+      <w:r>
+        <w:t>An earlier design used an embedding-based diversity weight (γ · MMR). Round-robin is cheaper, more predictable, and easier to explain. We can promote it back to a score weight in v2 if we need finer control.</w:t>
+      </w:r>
+    </w:p>
+    <w:p>
+      <w:pPr>
+        <w:pStyle w:val="Heading2"/>
+      </w:pPr>
+      <w:r>
+        <w:t>Step 6 — Quota repair (the safety net)</w:t>
+      </w:r>
+    </w:p>
+    <w:p>
+      <w:r>
+        <w:t>After scoring and round-robin, the librarian looks at the top 8 and asks: “Do at least 2 emerging artists appear?” (For top-5, the threshold is 1. The exact rule in code: ceil(K × 0.2), with a floor of 1.)</w:t>
       </w:r>
     </w:p>
     <w:p>
@@ -925,7 +823,7 @@
         <w:pStyle w:val="ListBullet"/>
       </w:pPr>
       <w:r>
-        <w:t>If no → swap the lowest-ranked non-emerging slot for the highest-ranked emerging artist outside the top 8 — but only if that emerging artist passed a relevance bar of 0.40.</w:t>
+        <w:t>If no → swap the lowest-ranked non-emerging slot for the highest-ranked emerging artist outside the top 8 — but only if that emerging artist passed a relevance bar of 0.40. The repaired row is flagged with quota_repaired: true so the UI can mark it.</w:t>
       </w:r>
     </w:p>
     <w:p>
@@ -936,7 +834,7 @@
         <w:t xml:space="preserve">Why the relevance bar? </w:t>
       </w:r>
       <w:r>
-        <w:t>Because we don't want to fill the quota with garbage. Underfill is better than spam. If no emerging artist passed the bar, we leave the slot alone.</w:t>
+        <w:t>Because we don’t want to fill the quota with garbage. Underfill is better than spam. If no emerging artist passed the bar, we leave the slot alone.</w:t>
       </w:r>
     </w:p>
     <w:p>
@@ -955,7 +853,7 @@
         <w:pStyle w:val="Heading2"/>
       </w:pPr>
       <w:r>
-        <w:t>Step 6 — Tag confidence levels</w:t>
+        <w:t>Step 7 — Tag confidence levels</w:t>
       </w:r>
     </w:p>
     <w:p>
@@ -977,39 +875,30 @@
       <w:tr>
         <w:tc>
           <w:tcPr>
-            <w:tcW w:type="dxa" w:w="1440"/>
+            <w:tcW w:type="dxa" w:w="2880"/>
           </w:tcPr>
           <w:p>
             <w:r>
-              <w:rPr>
-                <w:b/>
-              </w:rPr>
               <w:t>Tag</w:t>
             </w:r>
           </w:p>
         </w:tc>
         <w:tc>
           <w:tcPr>
-            <w:tcW w:type="dxa" w:w="2016"/>
+            <w:tcW w:type="dxa" w:w="2880"/>
           </w:tcPr>
           <w:p>
             <w:r>
-              <w:rPr>
-                <w:b/>
-              </w:rPr>
               <w:t>Relevance score</w:t>
             </w:r>
           </w:p>
         </w:tc>
         <w:tc>
           <w:tcPr>
-            <w:tcW w:type="dxa" w:w="5760"/>
+            <w:tcW w:type="dxa" w:w="2880"/>
           </w:tcPr>
           <w:p>
             <w:r>
-              <w:rPr>
-                <w:b/>
-              </w:rPr>
               <w:t>Meaning</w:t>
             </w:r>
           </w:p>
@@ -1018,7 +907,7 @@
       <w:tr>
         <w:tc>
           <w:tcPr>
-            <w:tcW w:type="dxa" w:w="1440"/>
+            <w:tcW w:type="dxa" w:w="2880"/>
           </w:tcPr>
           <w:p>
             <w:r>
@@ -1028,7 +917,7 @@
         </w:tc>
         <w:tc>
           <w:tcPr>
-            <w:tcW w:type="dxa" w:w="2016"/>
+            <w:tcW w:type="dxa" w:w="2880"/>
           </w:tcPr>
           <w:p>
             <w:r>
@@ -1038,7 +927,7 @@
         </w:tc>
         <w:tc>
           <w:tcPr>
-            <w:tcW w:type="dxa" w:w="5760"/>
+            <w:tcW w:type="dxa" w:w="2880"/>
           </w:tcPr>
           <w:p>
             <w:r>
@@ -1050,7 +939,7 @@
       <w:tr>
         <w:tc>
           <w:tcPr>
-            <w:tcW w:type="dxa" w:w="1440"/>
+            <w:tcW w:type="dxa" w:w="2880"/>
           </w:tcPr>
           <w:p>
             <w:r>
@@ -1060,7 +949,7 @@
         </w:tc>
         <w:tc>
           <w:tcPr>
-            <w:tcW w:type="dxa" w:w="2016"/>
+            <w:tcW w:type="dxa" w:w="2880"/>
           </w:tcPr>
           <w:p>
             <w:r>
@@ -1070,7 +959,7 @@
         </w:tc>
         <w:tc>
           <w:tcPr>
-            <w:tcW w:type="dxa" w:w="5760"/>
+            <w:tcW w:type="dxa" w:w="2880"/>
           </w:tcPr>
           <w:p>
             <w:r>
@@ -1082,7 +971,7 @@
       <w:tr>
         <w:tc>
           <w:tcPr>
-            <w:tcW w:type="dxa" w:w="1440"/>
+            <w:tcW w:type="dxa" w:w="2880"/>
           </w:tcPr>
           <w:p>
             <w:r>
@@ -1092,7 +981,7 @@
         </w:tc>
         <w:tc>
           <w:tcPr>
-            <w:tcW w:type="dxa" w:w="2016"/>
+            <w:tcW w:type="dxa" w:w="2880"/>
           </w:tcPr>
           <w:p>
             <w:r>
@@ -1102,7 +991,7 @@
         </w:tc>
         <w:tc>
           <w:tcPr>
-            <w:tcW w:type="dxa" w:w="5760"/>
+            <w:tcW w:type="dxa" w:w="2880"/>
           </w:tcPr>
           <w:p>
             <w:r>
@@ -1114,7 +1003,7 @@
       <w:tr>
         <w:tc>
           <w:tcPr>
-            <w:tcW w:type="dxa" w:w="1440"/>
+            <w:tcW w:type="dxa" w:w="2880"/>
           </w:tcPr>
           <w:p>
             <w:r>
@@ -1124,7 +1013,7 @@
         </w:tc>
         <w:tc>
           <w:tcPr>
-            <w:tcW w:type="dxa" w:w="2016"/>
+            <w:tcW w:type="dxa" w:w="2880"/>
           </w:tcPr>
           <w:p>
             <w:r>
@@ -1134,11 +1023,11 @@
         </w:tc>
         <w:tc>
           <w:tcPr>
-            <w:tcW w:type="dxa" w:w="5760"/>
+            <w:tcW w:type="dxa" w:w="2880"/>
           </w:tcPr>
           <w:p>
             <w:r>
-              <w:t>No good answer — reject the whole search and tell the user</w:t>
+              <w:t>No good answer — caller can choose to reject the search and tell the user</w:t>
             </w:r>
           </w:p>
         </w:tc>
@@ -1146,7 +1035,7 @@
     </w:tbl>
     <w:p>
       <w:r>
-        <w:t>The frontend uses these tags to decide whether to label a result "Recommended" or "Best we could find" — or to show a "no match" message instead.</w:t>
+        <w:t>The frontend uses these tags to decide whether to label a result “Recommended” or “Best we could find” — or to show a “no match” message instead.</w:t>
       </w:r>
     </w:p>
     <w:p>
@@ -1154,44 +1043,12 @@
         <w:pStyle w:val="Heading2"/>
       </w:pPr>
       <w:r>
-        <w:t>Step 7 — Log everything</w:t>
+        <w:t>Step 8 — Surface the score breakdown</w:t>
       </w:r>
     </w:p>
     <w:p>
       <w:r>
-        <w:t>Every search produces an audit record:</w:t>
-      </w:r>
-    </w:p>
-    <w:p>
-      <w:pPr>
-        <w:pStyle w:val="ListBullet"/>
-      </w:pPr>
-      <w:r>
-        <w:t>The buyer's query and filters</w:t>
-      </w:r>
-    </w:p>
-    <w:p>
-      <w:pPr>
-        <w:pStyle w:val="ListBullet"/>
-      </w:pPr>
-      <w:r>
-        <w:t>Which candidates passed the hard filter and which were dropped (with reasons)</w:t>
-      </w:r>
-    </w:p>
-    <w:p>
-      <w:pPr>
-        <w:pStyle w:val="ListBullet"/>
-      </w:pPr>
-      <w:r>
-        <w:t>The final ranked list, with each component score for every result</w:t>
-      </w:r>
-    </w:p>
-    <w:p>
-      <w:pPr>
-        <w:pStyle w:val="ListBullet"/>
-      </w:pPr>
-      <w:r>
-        <w:t>Which slots (if any) were filled by quota repair</w:t>
+        <w:t>Every returned row carries its component scores back to the caller: the raw relevance (rel), health bonus (health), price penalty (price_pen), and the final composite (score). The frontend can render any of these (e.g., “92% match” uses rel).</w:t>
       </w:r>
     </w:p>
     <w:p>
@@ -1202,7 +1059,7 @@
         <w:t xml:space="preserve">Why this matters. </w:t>
       </w:r>
       <w:r>
-        <w:t>If a teammate or a buyer ever asks "why did you rank these this way?" we can show them the per-component breakdown — instead of waving at a black box.</w:t>
+        <w:t>If a teammate or a buyer ever asks “why did you rank these this way?” the breakdown is right there in the response. Structured request-level audit logging — capturing the full candidate pool, filters, and swaps for replay — is on the deferred list (Section 6).</w:t>
       </w:r>
     </w:p>
     <w:p>
@@ -1232,13 +1089,10 @@
       <w:tr>
         <w:tc>
           <w:tcPr>
-            <w:tcW w:type="dxa" w:w="2304"/>
+            <w:tcW w:type="dxa" w:w="2880"/>
           </w:tcPr>
           <w:p>
             <w:r>
-              <w:rPr>
-                <w:b/>
-              </w:rPr>
               <w:t>Decision</w:t>
             </w:r>
           </w:p>
@@ -1249,22 +1103,16 @@
           </w:tcPr>
           <w:p>
             <w:r>
-              <w:rPr>
-                <w:b/>
-              </w:rPr>
               <w:t>Choice</w:t>
             </w:r>
           </w:p>
         </w:tc>
         <w:tc>
           <w:tcPr>
-            <w:tcW w:type="dxa" w:w="4032"/>
+            <w:tcW w:type="dxa" w:w="2880"/>
           </w:tcPr>
           <w:p>
             <w:r>
-              <w:rPr>
-                <w:b/>
-              </w:rPr>
               <w:t>Why</w:t>
             </w:r>
           </w:p>
@@ -1273,7 +1121,7 @@
       <w:tr>
         <w:tc>
           <w:tcPr>
-            <w:tcW w:type="dxa" w:w="2304"/>
+            <w:tcW w:type="dxa" w:w="2880"/>
           </w:tcPr>
           <w:p>
             <w:r>
@@ -1293,7 +1141,7 @@
         </w:tc>
         <w:tc>
           <w:tcPr>
-            <w:tcW w:type="dxa" w:w="4032"/>
+            <w:tcW w:type="dxa" w:w="2880"/>
           </w:tcPr>
           <w:p>
             <w:r>
@@ -1305,7 +1153,7 @@
       <w:tr>
         <w:tc>
           <w:tcPr>
-            <w:tcW w:type="dxa" w:w="2304"/>
+            <w:tcW w:type="dxa" w:w="2880"/>
           </w:tcPr>
           <w:p>
             <w:r>
@@ -1325,11 +1173,11 @@
         </w:tc>
         <w:tc>
           <w:tcPr>
-            <w:tcW w:type="dxa" w:w="4032"/>
+            <w:tcW w:type="dxa" w:w="2880"/>
           </w:tcPr>
           <w:p>
             <w:r>
-              <w:t>A buyer who says "music" does not want video; "verified" is a yes/no question</w:t>
+              <w:t>A buyer who says “music” does not want video; “verified” is a yes/no question</w:t>
             </w:r>
           </w:p>
         </w:tc>
@@ -1337,7 +1185,7 @@
       <w:tr>
         <w:tc>
           <w:tcPr>
-            <w:tcW w:type="dxa" w:w="2304"/>
+            <w:tcW w:type="dxa" w:w="2880"/>
           </w:tcPr>
           <w:p>
             <w:r>
@@ -1357,7 +1205,7 @@
         </w:tc>
         <w:tc>
           <w:tcPr>
-            <w:tcW w:type="dxa" w:w="4032"/>
+            <w:tcW w:type="dxa" w:w="2880"/>
           </w:tcPr>
           <w:p>
             <w:r>
@@ -1369,11 +1217,11 @@
       <w:tr>
         <w:tc>
           <w:tcPr>
-            <w:tcW w:type="dxa" w:w="2304"/>
+            <w:tcW w:type="dxa" w:w="2880"/>
           </w:tcPr>
           <w:p>
             <w:r>
-              <w:t>"Emerging" artist threshold</w:t>
+              <w:t>“Emerging” artist threshold</w:t>
             </w:r>
           </w:p>
         </w:tc>
@@ -1389,7 +1237,7 @@
         </w:tc>
         <w:tc>
           <w:tcPr>
-            <w:tcW w:type="dxa" w:w="4032"/>
+            <w:tcW w:type="dxa" w:w="2880"/>
           </w:tcPr>
           <w:p>
             <w:r>
@@ -1401,7 +1249,7 @@
       <w:tr>
         <w:tc>
           <w:tcPr>
-            <w:tcW w:type="dxa" w:w="2304"/>
+            <w:tcW w:type="dxa" w:w="2880"/>
           </w:tcPr>
           <w:p>
             <w:r>
@@ -1421,11 +1269,11 @@
         </w:tc>
         <w:tc>
           <w:tcPr>
-            <w:tcW w:type="dxa" w:w="4032"/>
+            <w:tcW w:type="dxa" w:w="2880"/>
           </w:tcPr>
           <w:p>
             <w:r>
-              <w:t>Modest safety net; the searcher's needs lead</w:t>
+              <w:t>Modest safety net; the searcher’s needs lead</w:t>
             </w:r>
           </w:p>
         </w:tc>
@@ -1433,7 +1281,7 @@
       <w:tr>
         <w:tc>
           <w:tcPr>
-            <w:tcW w:type="dxa" w:w="2304"/>
+            <w:tcW w:type="dxa" w:w="2880"/>
           </w:tcPr>
           <w:p>
             <w:r>
@@ -1453,11 +1301,11 @@
         </w:tc>
         <w:tc>
           <w:tcPr>
-            <w:tcW w:type="dxa" w:w="4032"/>
+            <w:tcW w:type="dxa" w:w="2880"/>
           </w:tcPr>
           <w:p>
             <w:r>
-              <w:t>Don't fill the quota with garbage — underfill beats spam</w:t>
+              <w:t>Don’t fill the quota with garbage — underfill beats spam</w:t>
             </w:r>
           </w:p>
         </w:tc>
@@ -1465,7 +1313,7 @@
       <w:tr>
         <w:tc>
           <w:tcPr>
-            <w:tcW w:type="dxa" w:w="2304"/>
+            <w:tcW w:type="dxa" w:w="2880"/>
           </w:tcPr>
           <w:p>
             <w:r>
@@ -1485,7 +1333,7 @@
         </w:tc>
         <w:tc>
           <w:tcPr>
-            <w:tcW w:type="dxa" w:w="4032"/>
+            <w:tcW w:type="dxa" w:w="2880"/>
           </w:tcPr>
           <w:p>
             <w:r>
@@ -1497,7 +1345,39 @@
       <w:tr>
         <w:tc>
           <w:tcPr>
-            <w:tcW w:type="dxa" w:w="2304"/>
+            <w:tcW w:type="dxa" w:w="2880"/>
+          </w:tcPr>
+          <w:p>
+            <w:r>
+              <w:t>γ weight (diversity)</w:t>
+            </w:r>
+          </w:p>
+        </w:tc>
+        <w:tc>
+          <w:tcPr>
+            <w:tcW w:type="dxa" w:w="2880"/>
+          </w:tcPr>
+          <w:p>
+            <w:r>
+              <w:t>0 — round-robin by artist instead</w:t>
+            </w:r>
+          </w:p>
+        </w:tc>
+        <w:tc>
+          <w:tcPr>
+            <w:tcW w:type="dxa" w:w="2880"/>
+          </w:tcPr>
+          <w:p>
+            <w:r>
+              <w:t>Cheaper and easier to explain than embedding-based MMR; can promote to a score weight in v2</w:t>
+            </w:r>
+          </w:p>
+        </w:tc>
+      </w:tr>
+      <w:tr>
+        <w:tc>
+          <w:tcPr>
+            <w:tcW w:type="dxa" w:w="2880"/>
           </w:tcPr>
           <w:p>
             <w:r>
@@ -1517,7 +1397,7 @@
         </w:tc>
         <w:tc>
           <w:tcPr>
-            <w:tcW w:type="dxa" w:w="4032"/>
+            <w:tcW w:type="dxa" w:w="2880"/>
           </w:tcPr>
           <w:p>
             <w:r>
@@ -1537,7 +1417,21 @@
     </w:p>
     <w:p>
       <w:r>
-        <w:t>We measure quality on a small set of hand-labeled "golden" queries — queries where we manually wrote down which results SHOULD appear. The latest measurements (against 6 golden queries on the real seed catalog of 148 works) are:</w:t>
+        <w:t>We measure quality on a small set of hand-labeled “golden” queries — queries where we manually wrote down which results SHOULD appear. The most recent measurements (against 6 golden queries on the seed catalog of 148 works) are reproduced below.</w:t>
+      </w:r>
+    </w:p>
+    <w:p>
+      <w:r>
+        <w:rPr>
+          <w:b/>
+        </w:rPr>
+        <w:t xml:space="preserve">Note: </w:t>
+      </w:r>
+      <w:r>
+        <w:rPr>
+          <w:i/>
+        </w:rPr>
+        <w:t>the numbers below were measured before γ went to 0 in production. They will move when re-measured against the live v1 ranker. Treat as directional until the next eval pass appends a fresh row to the change log.</w:t>
       </w:r>
     </w:p>
     <w:tbl>
@@ -1554,39 +1448,30 @@
       <w:tr>
         <w:tc>
           <w:tcPr>
-            <w:tcW w:type="dxa" w:w="2016"/>
+            <w:tcW w:type="dxa" w:w="2880"/>
           </w:tcPr>
           <w:p>
             <w:r>
-              <w:rPr>
-                <w:b/>
-              </w:rPr>
               <w:t>Metric</w:t>
             </w:r>
           </w:p>
         </w:tc>
         <w:tc>
           <w:tcPr>
-            <w:tcW w:type="dxa" w:w="5184"/>
+            <w:tcW w:type="dxa" w:w="2880"/>
           </w:tcPr>
           <w:p>
             <w:r>
-              <w:rPr>
-                <w:b/>
-              </w:rPr>
               <w:t>What it means</w:t>
             </w:r>
           </w:p>
         </w:tc>
         <w:tc>
           <w:tcPr>
-            <w:tcW w:type="dxa" w:w="2016"/>
+            <w:tcW w:type="dxa" w:w="2880"/>
           </w:tcPr>
           <w:p>
             <w:r>
-              <w:rPr>
-                <w:b/>
-              </w:rPr>
               <w:t>Latest result</w:t>
             </w:r>
           </w:p>
@@ -1595,7 +1480,7 @@
       <w:tr>
         <w:tc>
           <w:tcPr>
-            <w:tcW w:type="dxa" w:w="2016"/>
+            <w:tcW w:type="dxa" w:w="2880"/>
           </w:tcPr>
           <w:p>
             <w:r>
@@ -1605,7 +1490,7 @@
         </w:tc>
         <w:tc>
           <w:tcPr>
-            <w:tcW w:type="dxa" w:w="5184"/>
+            <w:tcW w:type="dxa" w:w="2880"/>
           </w:tcPr>
           <w:p>
             <w:r>
@@ -1615,7 +1500,7 @@
         </w:tc>
         <w:tc>
           <w:tcPr>
-            <w:tcW w:type="dxa" w:w="2016"/>
+            <w:tcW w:type="dxa" w:w="2880"/>
           </w:tcPr>
           <w:p>
             <w:r>
@@ -1627,7 +1512,7 @@
       <w:tr>
         <w:tc>
           <w:tcPr>
-            <w:tcW w:type="dxa" w:w="2016"/>
+            <w:tcW w:type="dxa" w:w="2880"/>
           </w:tcPr>
           <w:p>
             <w:r>
@@ -1637,7 +1522,7 @@
         </w:tc>
         <w:tc>
           <w:tcPr>
-            <w:tcW w:type="dxa" w:w="5184"/>
+            <w:tcW w:type="dxa" w:w="2880"/>
           </w:tcPr>
           <w:p>
             <w:r>
@@ -1647,7 +1532,7 @@
         </w:tc>
         <w:tc>
           <w:tcPr>
-            <w:tcW w:type="dxa" w:w="2016"/>
+            <w:tcW w:type="dxa" w:w="2880"/>
           </w:tcPr>
           <w:p>
             <w:r>
@@ -1659,7 +1544,7 @@
       <w:tr>
         <w:tc>
           <w:tcPr>
-            <w:tcW w:type="dxa" w:w="2016"/>
+            <w:tcW w:type="dxa" w:w="2880"/>
           </w:tcPr>
           <w:p>
             <w:r>
@@ -1669,7 +1554,7 @@
         </w:tc>
         <w:tc>
           <w:tcPr>
-            <w:tcW w:type="dxa" w:w="5184"/>
+            <w:tcW w:type="dxa" w:w="2880"/>
           </w:tcPr>
           <w:p>
             <w:r>
@@ -1679,7 +1564,7 @@
         </w:tc>
         <w:tc>
           <w:tcPr>
-            <w:tcW w:type="dxa" w:w="2016"/>
+            <w:tcW w:type="dxa" w:w="2880"/>
           </w:tcPr>
           <w:p>
             <w:r>
@@ -1691,7 +1576,7 @@
       <w:tr>
         <w:tc>
           <w:tcPr>
-            <w:tcW w:type="dxa" w:w="2016"/>
+            <w:tcW w:type="dxa" w:w="2880"/>
           </w:tcPr>
           <w:p>
             <w:r>
@@ -1701,7 +1586,7 @@
         </w:tc>
         <w:tc>
           <w:tcPr>
-            <w:tcW w:type="dxa" w:w="5184"/>
+            <w:tcW w:type="dxa" w:w="2880"/>
           </w:tcPr>
           <w:p>
             <w:r>
@@ -1711,7 +1596,7 @@
         </w:tc>
         <w:tc>
           <w:tcPr>
-            <w:tcW w:type="dxa" w:w="2016"/>
+            <w:tcW w:type="dxa" w:w="2880"/>
           </w:tcPr>
           <w:p>
             <w:r>
@@ -1723,7 +1608,7 @@
       <w:tr>
         <w:tc>
           <w:tcPr>
-            <w:tcW w:type="dxa" w:w="2016"/>
+            <w:tcW w:type="dxa" w:w="2880"/>
           </w:tcPr>
           <w:p>
             <w:r>
@@ -1733,7 +1618,7 @@
         </w:tc>
         <w:tc>
           <w:tcPr>
-            <w:tcW w:type="dxa" w:w="5184"/>
+            <w:tcW w:type="dxa" w:w="2880"/>
           </w:tcPr>
           <w:p>
             <w:r>
@@ -1743,7 +1628,7 @@
         </w:tc>
         <w:tc>
           <w:tcPr>
-            <w:tcW w:type="dxa" w:w="2016"/>
+            <w:tcW w:type="dxa" w:w="2880"/>
           </w:tcPr>
           <w:p>
             <w:r>
@@ -1755,7 +1640,7 @@
       <w:tr>
         <w:tc>
           <w:tcPr>
-            <w:tcW w:type="dxa" w:w="2016"/>
+            <w:tcW w:type="dxa" w:w="2880"/>
           </w:tcPr>
           <w:p>
             <w:r>
@@ -1765,17 +1650,17 @@
         </w:tc>
         <w:tc>
           <w:tcPr>
-            <w:tcW w:type="dxa" w:w="5184"/>
+            <w:tcW w:type="dxa" w:w="2880"/>
           </w:tcPr>
           <w:p>
             <w:r>
-              <w:t>What % of results respected the buyer's budget?</w:t>
+              <w:t>What % of results respected the buyer’s budget?</w:t>
             </w:r>
           </w:p>
         </w:tc>
         <w:tc>
           <w:tcPr>
-            <w:tcW w:type="dxa" w:w="2016"/>
+            <w:tcW w:type="dxa" w:w="2880"/>
           </w:tcPr>
           <w:p>
             <w:r>
@@ -1785,19 +1670,6 @@
         </w:tc>
       </w:tr>
     </w:tbl>
-    <w:p/>
-    <w:p>
-      <w:r>
-        <w:rPr>
-          <w:b/>
-        </w:rPr>
-        <w:t xml:space="preserve">A note on these numbers. </w:t>
-      </w:r>
-      <w:r>
-        <w:t>They will change every time we tune the algorithm. That is the point — without measurement, we cannot tell if a change made things better or worse. This table will be refreshed in this doc on every algorithm change.</w:t>
-      </w:r>
-    </w:p>
-    <w:p/>
     <w:p>
       <w:r>
         <w:rPr>
@@ -1806,7 +1678,7 @@
         <w:t xml:space="preserve">Why three layers of evaluation? </w:t>
       </w:r>
       <w:r>
-        <w:t>The numbers above are "Layer 1" (math metrics on a labeled test set). We also run "Layer 2" (marketplace-level metrics like emerging share, distinct artists shown, concentration) and we plan to add "Layer 3" (rubric-based judgment by a human or AI) once the team grows.</w:t>
+        <w:t>The numbers above are “Layer 1” (math metrics on a labeled test set). We also run “Layer 2” (marketplace-level metrics like emerging share, distinct artists shown, concentration) and we plan to add “Layer 3” (rubric-based judgment by a human or AI) once the team grows.</w:t>
       </w:r>
     </w:p>
     <w:p>
@@ -1819,12 +1691,12 @@
     </w:p>
     <w:p>
       <w:r>
-        <w:t>Three things we deliberately deferred. Each will turn on later, under specific conditions.</w:t>
+        <w:t>Four things we deliberately deferred. Each will turn on later, under specific conditions.</w:t>
       </w:r>
     </w:p>
     <w:p>
       <w:pPr>
-        <w:pStyle w:val="Heading2"/>
+        <w:pStyle w:val="Heading3"/>
       </w:pPr>
       <w:r>
         <w:t>β — Revenue weight</w:t>
@@ -1848,7 +1720,31 @@
     </w:p>
     <w:p>
       <w:pPr>
-        <w:pStyle w:val="Heading2"/>
+        <w:pStyle w:val="Heading3"/>
+      </w:pPr>
+      <w:r>
+        <w:t>γ — Embedding-based diversity weight</w:t>
+      </w:r>
+    </w:p>
+    <w:p>
+      <w:r>
+        <w:t>Right now γ = 0; diversity is handled mechanically by round-robin (Step 5). An MMR-style γ weight would let two near-identical works penalize each other within the score itself — finer control, but more expensive and harder to explain.</w:t>
+      </w:r>
+    </w:p>
+    <w:p>
+      <w:r>
+        <w:rPr>
+          <w:b/>
+        </w:rPr>
+        <w:t xml:space="preserve">Turn on when: </w:t>
+      </w:r>
+      <w:r>
+        <w:t>round-robin produces visibly clustered results in real searches, or when stylistic diversity (within an artist’s catalog) becomes the bottleneck.</w:t>
+      </w:r>
+    </w:p>
+    <w:p>
+      <w:pPr>
+        <w:pStyle w:val="Heading3"/>
       </w:pPr>
       <w:r>
         <w:t>Cold-start exploration</w:t>
@@ -1872,7 +1768,31 @@
     </w:p>
     <w:p>
       <w:pPr>
-        <w:pStyle w:val="Heading2"/>
+        <w:pStyle w:val="Heading3"/>
+      </w:pPr>
+      <w:r>
+        <w:t>Structured request-level audit logging</w:t>
+      </w:r>
+    </w:p>
+    <w:p>
+      <w:r>
+        <w:t>Every search currently returns its per-result score breakdown to the caller (Step 8), but we do not persist a full audit row capturing the candidate pool, hard-filter rejections, swap decisions, and post-quota state for replay. That is a separate piece of plumbing.</w:t>
+      </w:r>
+    </w:p>
+    <w:p>
+      <w:r>
+        <w:rPr>
+          <w:b/>
+        </w:rPr>
+        <w:t xml:space="preserve">Turn on when: </w:t>
+      </w:r>
+      <w:r>
+        <w:t>we need to debug specific buyer complaints (“why did this show?”) at scale, or when an algorithm change requires comparing rankings before-and-after on real traffic.</w:t>
+      </w:r>
+    </w:p>
+    <w:p>
+      <w:pPr>
+        <w:pStyle w:val="Heading3"/>
       </w:pPr>
       <w:r>
         <w:t>AI-judge evaluation</w:t>
@@ -1915,26 +1835,20 @@
       <w:tr>
         <w:tc>
           <w:tcPr>
-            <w:tcW w:type="dxa" w:w="2304"/>
+            <w:tcW w:type="dxa" w:w="4320"/>
           </w:tcPr>
           <w:p>
             <w:r>
-              <w:rPr>
-                <w:b/>
-              </w:rPr>
               <w:t>Term</w:t>
             </w:r>
           </w:p>
         </w:tc>
         <w:tc>
           <w:tcPr>
-            <w:tcW w:type="dxa" w:w="6912"/>
+            <w:tcW w:type="dxa" w:w="4320"/>
           </w:tcPr>
           <w:p>
             <w:r>
-              <w:rPr>
-                <w:b/>
-              </w:rPr>
               <w:t>Plain English</w:t>
             </w:r>
           </w:p>
@@ -1943,7 +1857,7 @@
       <w:tr>
         <w:tc>
           <w:tcPr>
-            <w:tcW w:type="dxa" w:w="2304"/>
+            <w:tcW w:type="dxa" w:w="4320"/>
           </w:tcPr>
           <w:p>
             <w:r>
@@ -1953,7 +1867,7 @@
         </w:tc>
         <w:tc>
           <w:tcPr>
-            <w:tcW w:type="dxa" w:w="6912"/>
+            <w:tcW w:type="dxa" w:w="4320"/>
           </w:tcPr>
           <w:p>
             <w:r>
@@ -1965,7 +1879,7 @@
       <w:tr>
         <w:tc>
           <w:tcPr>
-            <w:tcW w:type="dxa" w:w="2304"/>
+            <w:tcW w:type="dxa" w:w="4320"/>
           </w:tcPr>
           <w:p>
             <w:r>
@@ -1975,11 +1889,11 @@
         </w:tc>
         <w:tc>
           <w:tcPr>
-            <w:tcW w:type="dxa" w:w="6912"/>
+            <w:tcW w:type="dxa" w:w="4320"/>
           </w:tcPr>
           <w:p>
             <w:r>
-              <w:t>The buyer's text input (e.g., "moody lo-fi music")</w:t>
+              <w:t>The buyer’s text input (e.g., “moody lo-fi music”)</w:t>
             </w:r>
           </w:p>
         </w:tc>
@@ -1987,7 +1901,7 @@
       <w:tr>
         <w:tc>
           <w:tcPr>
-            <w:tcW w:type="dxa" w:w="2304"/>
+            <w:tcW w:type="dxa" w:w="4320"/>
           </w:tcPr>
           <w:p>
             <w:r>
@@ -1997,7 +1911,7 @@
         </w:tc>
         <w:tc>
           <w:tcPr>
-            <w:tcW w:type="dxa" w:w="6912"/>
+            <w:tcW w:type="dxa" w:w="4320"/>
           </w:tcPr>
           <w:p>
             <w:r>
@@ -2009,7 +1923,7 @@
       <w:tr>
         <w:tc>
           <w:tcPr>
-            <w:tcW w:type="dxa" w:w="2304"/>
+            <w:tcW w:type="dxa" w:w="4320"/>
           </w:tcPr>
           <w:p>
             <w:r>
@@ -2019,7 +1933,7 @@
         </w:tc>
         <w:tc>
           <w:tcPr>
-            <w:tcW w:type="dxa" w:w="6912"/>
+            <w:tcW w:type="dxa" w:w="4320"/>
           </w:tcPr>
           <w:p>
             <w:r>
@@ -2031,7 +1945,7 @@
       <w:tr>
         <w:tc>
           <w:tcPr>
-            <w:tcW w:type="dxa" w:w="2304"/>
+            <w:tcW w:type="dxa" w:w="4320"/>
           </w:tcPr>
           <w:p>
             <w:r>
@@ -2041,7 +1955,7 @@
         </w:tc>
         <w:tc>
           <w:tcPr>
-            <w:tcW w:type="dxa" w:w="6912"/>
+            <w:tcW w:type="dxa" w:w="4320"/>
           </w:tcPr>
           <w:p>
             <w:r>
@@ -2053,7 +1967,7 @@
       <w:tr>
         <w:tc>
           <w:tcPr>
-            <w:tcW w:type="dxa" w:w="2304"/>
+            <w:tcW w:type="dxa" w:w="4320"/>
           </w:tcPr>
           <w:p>
             <w:r>
@@ -2063,7 +1977,7 @@
         </w:tc>
         <w:tc>
           <w:tcPr>
-            <w:tcW w:type="dxa" w:w="6912"/>
+            <w:tcW w:type="dxa" w:w="4320"/>
           </w:tcPr>
           <w:p>
             <w:r>
@@ -2075,7 +1989,7 @@
       <w:tr>
         <w:tc>
           <w:tcPr>
-            <w:tcW w:type="dxa" w:w="2304"/>
+            <w:tcW w:type="dxa" w:w="4320"/>
           </w:tcPr>
           <w:p>
             <w:r>
@@ -2085,11 +1999,11 @@
         </w:tc>
         <w:tc>
           <w:tcPr>
-            <w:tcW w:type="dxa" w:w="6912"/>
+            <w:tcW w:type="dxa" w:w="4320"/>
           </w:tcPr>
           <w:p>
             <w:r>
-              <w:t>Total followers across an artist's linked socials (Instagram + TikTok + website)</w:t>
+              <w:t>Total followers across an artist’s linked socials (Instagram + TikTok + website)</w:t>
             </w:r>
           </w:p>
         </w:tc>
@@ -2097,7 +2011,7 @@
       <w:tr>
         <w:tc>
           <w:tcPr>
-            <w:tcW w:type="dxa" w:w="2304"/>
+            <w:tcW w:type="dxa" w:w="4320"/>
           </w:tcPr>
           <w:p>
             <w:r>
@@ -2107,7 +2021,7 @@
         </w:tc>
         <w:tc>
           <w:tcPr>
-            <w:tcW w:type="dxa" w:w="6912"/>
+            <w:tcW w:type="dxa" w:w="4320"/>
           </w:tcPr>
           <w:p>
             <w:r>
@@ -2119,7 +2033,7 @@
       <w:tr>
         <w:tc>
           <w:tcPr>
-            <w:tcW w:type="dxa" w:w="2304"/>
+            <w:tcW w:type="dxa" w:w="4320"/>
           </w:tcPr>
           <w:p>
             <w:r>
@@ -2129,7 +2043,7 @@
         </w:tc>
         <w:tc>
           <w:tcPr>
-            <w:tcW w:type="dxa" w:w="6912"/>
+            <w:tcW w:type="dxa" w:w="4320"/>
           </w:tcPr>
           <w:p>
             <w:r>
@@ -2141,21 +2055,21 @@
       <w:tr>
         <w:tc>
           <w:tcPr>
-            <w:tcW w:type="dxa" w:w="2304"/>
+            <w:tcW w:type="dxa" w:w="4320"/>
           </w:tcPr>
           <w:p>
             <w:r>
-              <w:t>Audit log</w:t>
+              <w:t>Score breakdown</w:t>
             </w:r>
           </w:p>
         </w:tc>
         <w:tc>
           <w:tcPr>
-            <w:tcW w:type="dxa" w:w="6912"/>
+            <w:tcW w:type="dxa" w:w="4320"/>
           </w:tcPr>
           <w:p>
             <w:r>
-              <w:t>A record of every search and its outputs, for debugging and explanation</w:t>
+              <w:t>Per-result component scores (rel, health, price_pen) returned with every search</w:t>
             </w:r>
           </w:p>
         </w:tc>
@@ -2163,7 +2077,7 @@
       <w:tr>
         <w:tc>
           <w:tcPr>
-            <w:tcW w:type="dxa" w:w="2304"/>
+            <w:tcW w:type="dxa" w:w="4320"/>
           </w:tcPr>
           <w:p>
             <w:r>
@@ -2173,7 +2087,7 @@
         </w:tc>
         <w:tc>
           <w:tcPr>
-            <w:tcW w:type="dxa" w:w="6912"/>
+            <w:tcW w:type="dxa" w:w="4320"/>
           </w:tcPr>
           <w:p>
             <w:r>
@@ -2210,39 +2124,30 @@
       <w:tr>
         <w:tc>
           <w:tcPr>
-            <w:tcW w:type="dxa" w:w="1440"/>
+            <w:tcW w:type="dxa" w:w="2880"/>
           </w:tcPr>
           <w:p>
             <w:r>
-              <w:rPr>
-                <w:b/>
-              </w:rPr>
               <w:t>Date</w:t>
             </w:r>
           </w:p>
         </w:tc>
         <w:tc>
           <w:tcPr>
-            <w:tcW w:type="dxa" w:w="5184"/>
+            <w:tcW w:type="dxa" w:w="2880"/>
           </w:tcPr>
           <w:p>
             <w:r>
-              <w:rPr>
-                <w:b/>
-              </w:rPr>
               <w:t>What changed</w:t>
             </w:r>
           </w:p>
         </w:tc>
         <w:tc>
           <w:tcPr>
-            <w:tcW w:type="dxa" w:w="2592"/>
+            <w:tcW w:type="dxa" w:w="2880"/>
           </w:tcPr>
           <w:p>
             <w:r>
-              <w:rPr>
-                <w:b/>
-              </w:rPr>
               <w:t>Why</w:t>
             </w:r>
           </w:p>
@@ -2251,7 +2156,7 @@
       <w:tr>
         <w:tc>
           <w:tcPr>
-            <w:tcW w:type="dxa" w:w="1440"/>
+            <w:tcW w:type="dxa" w:w="2880"/>
           </w:tcPr>
           <w:p>
             <w:r>
@@ -2261,7 +2166,39 @@
         </w:tc>
         <w:tc>
           <w:tcPr>
-            <w:tcW w:type="dxa" w:w="5184"/>
+            <w:tcW w:type="dxa" w:w="2880"/>
+          </w:tcPr>
+          <w:p>
+            <w:r>
+              <w:t>Doc aligned with the shipped v1 ranker. Removed γ (diversity) from the score formula — it is 0 in production, since round-robin by artist handles diversity mechanically; γ is now described in Section 6 as a deferred weight. Pipeline split from 7 steps into 8 (round-robin gets its own step). Worked-example scores recomputed with the v1 formula. Candidate pool size updated to 60 (was described as 30; code uses max(K × 6, 60)). Replaced the old “Log everything” step with “Surface the score breakdown” — honest about what the code does. Structured request-level audit logging moved to Section 6 (deferred).</w:t>
+            </w:r>
+          </w:p>
+        </w:tc>
+        <w:tc>
+          <w:tcPr>
+            <w:tcW w:type="dxa" w:w="2880"/>
+          </w:tcPr>
+          <w:p>
+            <w:r>
+              <w:t>Living-doc rule: doc tracks the code. Caught during a sync pass after the v1 deploy.</w:t>
+            </w:r>
+          </w:p>
+        </w:tc>
+      </w:tr>
+      <w:tr>
+        <w:tc>
+          <w:tcPr>
+            <w:tcW w:type="dxa" w:w="2880"/>
+          </w:tcPr>
+          <w:p>
+            <w:r>
+              <w:t>2026-04-25</w:t>
+            </w:r>
+          </w:p>
+        </w:tc>
+        <w:tc>
+          <w:tcPr>
+            <w:tcW w:type="dxa" w:w="2880"/>
           </w:tcPr>
           <w:p>
             <w:r>
@@ -2271,11 +2208,11 @@
         </w:tc>
         <w:tc>
           <w:tcPr>
-            <w:tcW w:type="dxa" w:w="2592"/>
+            <w:tcW w:type="dxa" w:w="2880"/>
           </w:tcPr>
           <w:p>
             <w:r>
-              <w:t>Prove the algorithm in the live UI. Note: γ (MMR style diversity) stays 0 in production v1 because we don't fetch embeddings client-side; round-robin by artist_id is the diversity mechanism. β (revenue) still 0. SQL migration for filter-aware search_works RPC is deferred (filters applied in TypeScript after fetching candidate metadata).</w:t>
+              <w:t>Prove the algorithm in the live UI. γ (MMR-style diversity) stays 0 in production v1 because we don’t fetch embeddings client-side; round-robin by artist_id is the diversity mechanism. β (revenue) still 0. SQL migration for filter-aware search_works RPC is deferred (filters applied in TypeScript after fetching candidate metadata).</w:t>
             </w:r>
           </w:p>
         </w:tc>
@@ -2283,7 +2220,7 @@
       <w:tr>
         <w:tc>
           <w:tcPr>
-            <w:tcW w:type="dxa" w:w="1440"/>
+            <w:tcW w:type="dxa" w:w="2880"/>
           </w:tcPr>
           <w:p>
             <w:r>
@@ -2293,7 +2230,7 @@
         </w:tc>
         <w:tc>
           <w:tcPr>
-            <w:tcW w:type="dxa" w:w="5184"/>
+            <w:tcW w:type="dxa" w:w="2880"/>
           </w:tcPr>
           <w:p>
             <w:r>
@@ -2303,21 +2240,16 @@
         </w:tc>
         <w:tc>
           <w:tcPr>
-            <w:tcW w:type="dxa" w:w="2592"/>
+            <w:tcW w:type="dxa" w:w="2880"/>
           </w:tcPr>
           <w:p>
             <w:r>
-              <w:t>Strategic stance locked via group discussion: "emerging-first with searcher's needs respected." β stays off.</w:t>
+              <w:t>Strategic stance locked via group discussion: “emerging-first with searcher’s needs respected.” β stays off.</w:t>
             </w:r>
           </w:p>
         </w:tc>
       </w:tr>
     </w:tbl>
-    <w:p>
-      <w:r>
-        <w:br w:type="page"/>
-      </w:r>
-    </w:p>
     <w:p>
       <w:pPr>
         <w:pStyle w:val="Heading1"/>
@@ -2328,7 +2260,7 @@
     </w:p>
     <w:p>
       <w:r>
-        <w:t>This is a living document. Every time the algorithm in algorithm_design.ipynb changes, the relevant section here will be updated and a new row will be added to the change log. If you ever find a discrepancy between what the notebook does and what this document says, that is a bug — flag it and we will fix it.</w:t>
+        <w:t>This is a living document. Every time the algorithm in algorithm_design.ipynb or web/lib/search.ts changes, the relevant section here will be updated and a new row will be added to the change log. If you ever find a discrepancy between what the code does and what this document says, that is a bug — flag it and we will fix it.</w:t>
       </w:r>
     </w:p>
     <w:p>
@@ -2709,10 +2641,6 @@
     <w:name w:val="Normal"/>
     <w:qFormat/>
     <w:rsid w:val="00FC693F"/>
-    <w:rPr>
-      <w:rFonts w:ascii="Calibri" w:hAnsi="Calibri"/>
-      <w:sz w:val="22"/>
-    </w:rPr>
   </w:style>
   <w:style w:type="paragraph" w:styleId="Header">
     <w:name w:val="header"/>

</xml_diff>

<commit_message>
how_search_works.docx: companion is algorithm_v1_production, not design
The doc describes the live v1 algorithm — same scope as the new
algorithm_v1_production.ipynb, not the wider design space in
algorithm_design.ipynb. Subtitle and closing note updated; design
notebook still mentioned in the closing note as the place to look
for v2 candidates and MMR exploration.

Co-Authored-By: Claude Opus 4.7 (1M context) <noreply@anthropic.com>
</commit_message>
<xml_diff>
--- a/notebooks/how_search_works.docx
+++ b/notebooks/how_search_works.docx
@@ -15,7 +15,7 @@
         <w:rPr>
           <w:i/>
         </w:rPr>
-        <w:t>Companion to algorithm_design.ipynb · Living document — last updated 2026-04-25 · OIT 277 Artist Marketplace project</w:t>
+        <w:t>Companion to algorithm_v1_production.ipynb · Living document — last updated 2026-04-25 · OIT 277 Artist Marketplace project</w:t>
       </w:r>
     </w:p>
     <w:p>
@@ -2260,7 +2260,7 @@
     </w:p>
     <w:p>
       <w:r>
-        <w:t>This is a living document. Every time the algorithm in algorithm_design.ipynb or web/lib/search.ts changes, the relevant section here will be updated and a new row will be added to the change log. If you ever find a discrepancy between what the code does and what this document says, that is a bug — flag it and we will fix it.</w:t>
+        <w:t>This is a living document. It tracks the production v1 algorithm mirrored in algorithm_v1_production.ipynb and shipped in web/lib/search.ts. Every time the production code changes, the relevant section here will be updated and a new row will be added to the change log. (For the wider design space — v2 candidates, MMR diversity, exploration, audit logging — see algorithm_design.ipynb.) If you ever find a discrepancy between what the code does and what this document says, that is a bug — flag it and we will fix it.</w:t>
       </w:r>
     </w:p>
     <w:p>

</xml_diff>